<commit_message>
Switch intake to group-first folder layout
Per-group folders (Intake\FE\2026-08.xlsx) replace month-first folders:
each group gets write access to its own folder only, ownership is
self-evident, and the Power Query path is set once and never edited -
month roll-over becomes changing the IntakeMonth cell on Settings and
Refresh All.

- intake/: restructured to <Group>/2026-07.xlsx
- Master: Settings reworked (IntakeRoot + IntakeMonth named range),
  START HERE instructions updated, Consolidated Source File column now
  shows GroupFolder\file.xlsx so duplicate month-files are visible
- PowerQuery-Import.md: root-recursive query filtered by IntakeMonth,
  duplicate-file guidance
- Process guide (docx/html/pdf) and README updated to match

Co-Authored-By: Claude Fable 5 <noreply@anthropic.com>
Claude-Session: https://claude.ai/code/session_01DBbqxUN9AD2FdtJjEWSJGT
</commit_message>
<xml_diff>
--- a/call-delivery/docs/Call_Delivery_Intake_Process_Guide.docx
+++ b/call-delivery/docs/Call_Delivery_Intake_Process_Guide.docx
@@ -381,7 +381,7 @@
           <w:color w:val="2E5AAC"/>
           <w:sz w:val="28"/>
         </w:rPr>
-        <w:t>4. Save to the shared folder with the exact name</w:t>
+        <w:t>4. Save into YOUR group's folder, named by month</w:t>
       </w:r>
     </w:p>
     <w:tbl>
@@ -409,7 +409,7 @@
                 <w:color w:val="1B4D3E"/>
                 <w:sz w:val="18"/>
               </w:rPr>
-              <w:t>\\CallDelivery\Intake\&lt;YYYY-MM&gt;\&lt;GROUP&gt;.xlsx</w:t>
+              <w:t>\\CallDelivery\Intake\&lt;YOUR GROUP&gt;\&lt;YYYY-MM&gt;.xlsx</w:t>
             </w:r>
           </w:p>
           <w:p>
@@ -422,7 +422,7 @@
                 <w:color w:val="1B4D3E"/>
                 <w:sz w:val="18"/>
               </w:rPr>
-              <w:t>Example:  \\CallDelivery\Intake\2026-07\FE.xlsx</w:t>
+              <w:t>Example:  \\CallDelivery\Intake\FE\2026-08.xlsx</w:t>
             </w:r>
           </w:p>
         </w:tc>
@@ -434,7 +434,7 @@
         <w:pStyle w:val="ListBullet"/>
       </w:pPr>
       <w:r>
-        <w:t>One file per group per month.</w:t>
+        <w:t>Each group has its own folder, with write access to that folder only; one file per month named YYYY-MM.xlsx.</w:t>
       </w:r>
     </w:p>
     <w:p>
@@ -442,7 +442,7 @@
         <w:pStyle w:val="ListBullet"/>
       </w:pPr>
       <w:r>
-        <w:t>When your schedule changes, overwrite the same file — the next refresh picks it up.</w:t>
+        <w:t>When your schedule changes, overwrite the same file — never save a v2 copy (two files for one month would both import).</w:t>
       </w:r>
     </w:p>
     <w:p>
@@ -523,7 +523,7 @@
         <w:pStyle w:val="ListNumber"/>
       </w:pPr>
       <w:r>
-        <w:t>Set FolderPath to your real shared path (UNC path or a synced OneDrive/SharePoint path).</w:t>
+        <w:t>Set IntakeRoot to your real shared path (one time only — it never changes at month roll-over).</w:t>
       </w:r>
     </w:p>
     <w:p>
@@ -585,7 +585,7 @@
                 <w:color w:val="1B4D3E"/>
                 <w:sz w:val="18"/>
               </w:rPr>
-              <w:t xml:space="preserve">    // 1. Point at the current month's intake folder</w:t>
+              <w:t xml:space="preserve">    // 1. The Intake ROOT - set once, never changes month to month</w:t>
             </w:r>
           </w:p>
           <w:p>
@@ -598,7 +598,7 @@
                 <w:color w:val="1B4D3E"/>
                 <w:sz w:val="18"/>
               </w:rPr>
-              <w:t xml:space="preserve">    FolderPath = "\\CallDelivery\Intake\2026-07",</w:t>
+              <w:t xml:space="preserve">    IntakeRoot = "\\CallDelivery\Intake",</w:t>
             </w:r>
           </w:p>
           <w:p>
@@ -623,7 +623,33 @@
                 <w:color w:val="1B4D3E"/>
                 <w:sz w:val="18"/>
               </w:rPr>
-              <w:t xml:space="preserve">    Source     = Folder.Files(FolderPath),</w:t>
+              <w:t xml:space="preserve">    // 2. The month to load (e.g. "2026-08") - read from the master's</w:t>
+            </w:r>
+          </w:p>
+          <w:p>
+            <w:pPr>
+              <w:spacing w:after="0" w:before="0"/>
+            </w:pPr>
+            <w:r>
+              <w:rPr>
+                <w:rFonts w:ascii="Consolas" w:hAnsi="Consolas"/>
+                <w:color w:val="1B4D3E"/>
+                <w:sz w:val="18"/>
+              </w:rPr>
+              <w:t xml:space="preserve">    //    Settings tab via the IntakeMonth named range</w:t>
+            </w:r>
+          </w:p>
+          <w:p>
+            <w:pPr>
+              <w:spacing w:after="0" w:before="0"/>
+            </w:pPr>
+            <w:r>
+              <w:rPr>
+                <w:rFonts w:ascii="Consolas" w:hAnsi="Consolas"/>
+                <w:color w:val="1B4D3E"/>
+                <w:sz w:val="18"/>
+              </w:rPr>
+              <w:t xml:space="preserve">    Month      = Excel.CurrentWorkbook(){[Name="IntakeMonth"]}[Content]{0}[Column1],</w:t>
             </w:r>
           </w:p>
           <w:p>
@@ -648,7 +674,45 @@
                 <w:color w:val="1B4D3E"/>
                 <w:sz w:val="18"/>
               </w:rPr>
-              <w:t xml:space="preserve">    // 2. Keep real .xlsx files only; drop Excel's temp lock files (~$...)</w:t>
+              <w:t xml:space="preserve">    // 3. Read every group subfolder under the root</w:t>
+            </w:r>
+          </w:p>
+          <w:p>
+            <w:pPr>
+              <w:spacing w:after="0" w:before="0"/>
+            </w:pPr>
+            <w:r>
+              <w:rPr>
+                <w:rFonts w:ascii="Consolas" w:hAnsi="Consolas"/>
+                <w:color w:val="1B4D3E"/>
+                <w:sz w:val="18"/>
+              </w:rPr>
+              <w:t xml:space="preserve">    Source     = Folder.Files(IntakeRoot),</w:t>
+            </w:r>
+          </w:p>
+          <w:p>
+            <w:pPr>
+              <w:spacing w:after="0" w:before="0"/>
+            </w:pPr>
+            <w:r>
+              <w:rPr>
+                <w:rFonts w:ascii="Consolas" w:hAnsi="Consolas"/>
+                <w:color w:val="1B4D3E"/>
+                <w:sz w:val="18"/>
+              </w:rPr>
+            </w:r>
+          </w:p>
+          <w:p>
+            <w:pPr>
+              <w:spacing w:after="0" w:before="0"/>
+            </w:pPr>
+            <w:r>
+              <w:rPr>
+                <w:rFonts w:ascii="Consolas" w:hAnsi="Consolas"/>
+                <w:color w:val="1B4D3E"/>
+                <w:sz w:val="18"/>
+              </w:rPr>
+              <w:t xml:space="preserve">    // 4. Keep this month's real .xlsx files; drop temp lock files (~$...)</w:t>
             </w:r>
           </w:p>
           <w:p>
@@ -674,7 +738,33 @@
                 <w:color w:val="1B4D3E"/>
                 <w:sz w:val="18"/>
               </w:rPr>
-              <w:t xml:space="preserve">                    [Extension] = ".xlsx" and not Text.StartsWith([Name], "~$")),</w:t>
+              <w:t xml:space="preserve">                    [Extension] = ".xlsx"</w:t>
+            </w:r>
+          </w:p>
+          <w:p>
+            <w:pPr>
+              <w:spacing w:after="0" w:before="0"/>
+            </w:pPr>
+            <w:r>
+              <w:rPr>
+                <w:rFonts w:ascii="Consolas" w:hAnsi="Consolas"/>
+                <w:color w:val="1B4D3E"/>
+                <w:sz w:val="18"/>
+              </w:rPr>
+              <w:t xml:space="preserve">                    and not Text.StartsWith([Name], "~$")</w:t>
+            </w:r>
+          </w:p>
+          <w:p>
+            <w:pPr>
+              <w:spacing w:after="0" w:before="0"/>
+            </w:pPr>
+            <w:r>
+              <w:rPr>
+                <w:rFonts w:ascii="Consolas" w:hAnsi="Consolas"/>
+                <w:color w:val="1B4D3E"/>
+                <w:sz w:val="18"/>
+              </w:rPr>
+              <w:t xml:space="preserve">                    and Text.StartsWith([Name], Month)),</w:t>
             </w:r>
           </w:p>
           <w:p>
@@ -699,7 +789,7 @@
                 <w:color w:val="1B4D3E"/>
                 <w:sz w:val="18"/>
               </w:rPr>
-              <w:t xml:space="preserve">    // 3. From each workbook, grab the table named tblSchedule</w:t>
+              <w:t xml:space="preserve">    // 5. From each workbook, grab the table named tblSchedule</w:t>
             </w:r>
           </w:p>
           <w:p>
@@ -725,46 +815,7 @@
                 <w:color w:val="1B4D3E"/>
                 <w:sz w:val="18"/>
               </w:rPr>
-              <w:t xml:space="preserve">                    let</w:t>
-            </w:r>
-          </w:p>
-          <w:p>
-            <w:pPr>
-              <w:spacing w:after="0" w:before="0"/>
-            </w:pPr>
-            <w:r>
-              <w:rPr>
-                <w:rFonts w:ascii="Consolas" w:hAnsi="Consolas"/>
-                <w:color w:val="1B4D3E"/>
-                <w:sz w:val="18"/>
-              </w:rPr>
-              <w:t xml:space="preserve">                        Book = Excel.Workbook([Content], true),</w:t>
-            </w:r>
-          </w:p>
-          <w:p>
-            <w:pPr>
-              <w:spacing w:after="0" w:before="0"/>
-            </w:pPr>
-            <w:r>
-              <w:rPr>
-                <w:rFonts w:ascii="Consolas" w:hAnsi="Consolas"/>
-                <w:color w:val="1B4D3E"/>
-                <w:sz w:val="18"/>
-              </w:rPr>
-              <w:t xml:space="preserve">                        Tbl  = Book{[Item="tblSchedule", Kind="Table"]}[Data]</w:t>
-            </w:r>
-          </w:p>
-          <w:p>
-            <w:pPr>
-              <w:spacing w:after="0" w:before="0"/>
-            </w:pPr>
-            <w:r>
-              <w:rPr>
-                <w:rFonts w:ascii="Consolas" w:hAnsi="Consolas"/>
-                <w:color w:val="1B4D3E"/>
-                <w:sz w:val="18"/>
-              </w:rPr>
-              <w:t xml:space="preserve">                    in  Tbl),</w:t>
+              <w:t xml:space="preserve">                    Excel.Workbook([Content], true){[Item="tblSchedule", Kind="Table"]}[Data]),</w:t>
             </w:r>
           </w:p>
           <w:p>
@@ -789,7 +840,7 @@
                 <w:color w:val="1B4D3E"/>
                 <w:sz w:val="18"/>
               </w:rPr>
-              <w:t xml:space="preserve">    // 4. Expand every group's rows into one long table</w:t>
+              <w:t xml:space="preserve">    // 6. Expand every group's rows into one long table</w:t>
             </w:r>
           </w:p>
           <w:p>
@@ -853,7 +904,7 @@
                 <w:color w:val="1B4D3E"/>
                 <w:sz w:val="18"/>
               </w:rPr>
-              <w:t xml:space="preserve">    // 5. Drop blank rows (unused template rows have no Date)</w:t>
+              <w:t xml:space="preserve">    // 7. Drop blank rows (unused template rows have no Date)</w:t>
             </w:r>
           </w:p>
           <w:p>
@@ -891,7 +942,7 @@
                 <w:color w:val="1B4D3E"/>
                 <w:sz w:val="18"/>
               </w:rPr>
-              <w:t xml:space="preserve">    // 6. Type the columns; keep source filename for audit</w:t>
+              <w:t xml:space="preserve">    // 8. Source File = "GroupFolder\file.xlsx" - makes ownership and</w:t>
             </w:r>
           </w:p>
           <w:p>
@@ -904,7 +955,7 @@
                 <w:color w:val="1B4D3E"/>
                 <w:sz w:val="18"/>
               </w:rPr>
-              <w:t xml:space="preserve">    Renamed    = Table.RenameColumns(NoBlanks, {{"Name", "Source File"}}),</w:t>
+              <w:t xml:space="preserve">    //    duplicate files visible at a glance</w:t>
             </w:r>
           </w:p>
           <w:p>
@@ -917,7 +968,45 @@
                 <w:color w:val="1B4D3E"/>
                 <w:sz w:val="18"/>
               </w:rPr>
-              <w:t xml:space="preserve">    Keep       = Table.SelectColumns(Renamed,</w:t>
+              <w:t xml:space="preserve">    WithSrc    = Table.AddColumn(NoBlanks, "Source File", each</w:t>
+            </w:r>
+          </w:p>
+          <w:p>
+            <w:pPr>
+              <w:spacing w:after="0" w:before="0"/>
+            </w:pPr>
+            <w:r>
+              <w:rPr>
+                <w:rFonts w:ascii="Consolas" w:hAnsi="Consolas"/>
+                <w:color w:val="1B4D3E"/>
+                <w:sz w:val="18"/>
+              </w:rPr>
+              <w:t xml:space="preserve">                    Text.AfterDelimiter([Folder Path], IntakeRoot &amp; "\") &amp; [Name]),</w:t>
+            </w:r>
+          </w:p>
+          <w:p>
+            <w:pPr>
+              <w:spacing w:after="0" w:before="0"/>
+            </w:pPr>
+            <w:r>
+              <w:rPr>
+                <w:rFonts w:ascii="Consolas" w:hAnsi="Consolas"/>
+                <w:color w:val="1B4D3E"/>
+                <w:sz w:val="18"/>
+              </w:rPr>
+            </w:r>
+          </w:p>
+          <w:p>
+            <w:pPr>
+              <w:spacing w:after="0" w:before="0"/>
+            </w:pPr>
+            <w:r>
+              <w:rPr>
+                <w:rFonts w:ascii="Consolas" w:hAnsi="Consolas"/>
+                <w:color w:val="1B4D3E"/>
+                <w:sz w:val="18"/>
+              </w:rPr>
+              <w:t xml:space="preserve">    Keep       = Table.SelectColumns(WithSrc,</w:t>
             </w:r>
           </w:p>
           <w:p>
@@ -1054,7 +1143,7 @@
         <w:pStyle w:val="ListBullet"/>
       </w:pPr>
       <w:r>
-        <w:t>New month = one edit: change the 2026-07 in FolderPath and refresh (this can be parameterized to a workbook cell).</w:t>
+        <w:t>New month: change the Month to load cell on the master's Settings tab (the IntakeMonth named range) and Refresh All — the query path never changes.</w:t>
       </w:r>
     </w:p>
     <w:p>

</xml_diff>